<commit_message>
docs(reports): close Sprint 3 sign-off — Stage B 10/10 PASS
Tarry's editorial UAT closed 2026-05-14 with all 10 in-browser
steps green. B9 + B10 exercised end-to-end via the first real
Dispatch — "Four Weeks That Bent the AI Arc" now live at
/blog/four-weeks-that-bent-the-ai-arc. Four follow-up fixes
shipped mid-flight (PRs #11–14: aspirational UI label dropped,
autosave stale-closure, autosave-on-mount overwrote a 387-word
draft, no UI trash button on draft cards). Every fix carries a
"caught at <step>" trail in the commit log.

Also adds SP3-08 (theme: studio variant) + SP3-09 (tags surface)
to the follow-up issues table — both parsed-but-not-rendered;
filed to Sprint 4.5.

Co-Authored-By: Claude Opus 4.7 (1M context) <noreply@anthropic.com>
</commit_message>
<xml_diff>
--- a/docs/reports/sprint-3-uat-plan.docx
+++ b/docs/reports/sprint-3-uat-plan.docx
@@ -83,7 +83,7 @@
         </w:rPr>
         <w:t xml:space="preserve"> </w:t>
       </w:r>
-      <w:hyperlink w:history="1" r:id="rIdqs4vrvcyppnqvz1_9iavb">
+      <w:hyperlink w:history="1" r:id="rId4rfc7h0vd_u8xy2gona6s">
         <w:r>
           <w:rPr>
             <w:rFonts w:ascii="Georgia" w:cs="Georgia" w:eastAsia="Georgia" w:hAnsi="Georgia"/>
@@ -104,7 +104,7 @@
         </w:rPr>
         <w:t xml:space="preserve"> · </w:t>
       </w:r>
-      <w:hyperlink w:history="1" r:id="rId1hjd8ganov1vphpwibbv8">
+      <w:hyperlink w:history="1" r:id="rId3vbkyk92ofbtkory76-xe">
         <w:r>
           <w:rPr>
             <w:rFonts w:ascii="Georgia" w:cs="Georgia" w:eastAsia="Georgia" w:hAnsi="Georgia"/>
@@ -145,7 +145,7 @@
         </w:rPr>
         <w:t xml:space="preserve"> </w:t>
       </w:r>
-      <w:hyperlink w:history="1" r:id="rIdclhw2gdcavcab_gzapxun">
+      <w:hyperlink w:history="1" r:id="rId0yutpl982xowmrkjawsdg">
         <w:r>
           <w:rPr>
             <w:rFonts w:ascii="Georgia" w:cs="Georgia" w:eastAsia="Georgia" w:hAnsi="Georgia"/>
@@ -3906,7 +3906,7 @@
         </w:rPr>
         <w:t xml:space="preserve">Mobile-first writing UX is deferred to Sprint 6 per the </w:t>
       </w:r>
-      <w:hyperlink w:history="1" r:id="rIdf8njwao_ypx3an0t5xyij">
+      <w:hyperlink w:history="1" r:id="rIdnr5idk4o4yw-ycjtd2ew_">
         <w:r>
           <w:rPr>
             <w:rFonts w:ascii="Georgia" w:cs="Georgia" w:eastAsia="Georgia" w:hAnsi="Georgia"/>

</xml_diff>